<commit_message>
Refine the three new scripts: bio, homework beat, pushback answers
Personal intro rewritten across Moncler, Community and LanguageWire per
the latest direction: Middle East career on exclusive accounts in
football and gaming, notable strategic partnerships, Formula 1 as a
priority global vertical, role framed as driving strategic partnerships
with Bjorn and George. Part 2 now opens with a show-your-homework beat
plus a why-now timing line tailored to each brand. Each script gains a
Q12 pushback answer: Moncler on rights, licensing and co-branded
merchandise mechanics; Community on fan data ownership and consent;
LanguageWire on what a supplier-tier package includes.

Co-Authored-By: Claude Fable 5 <noreply@anthropic.com>
Claude-Session: https://claude.ai/code/session_011Vvxd2V3zerAfjn84yXuuv
</commit_message>
<xml_diff>
--- a/call-scripts/Community-F1-Discovery-Call-Script.docx
+++ b/call-scripts/Community-F1-Discovery-Call-Script.docx
@@ -854,20 +854,20 @@
         <w:ind w:left="280" w:right="120"/>
       </w:pPr>
       <w:r>
-        <w:t xml:space="preserve">"I sit in the global sales team at SPORTFIVE, and I look after brand partnerships for our Formula 1 and motorsport business.</w:t>
-      </w:r>
-    </w:p>
-    <w:p>
-      <w:pPr>
-        <w:pBdr>
-          <w:left w:val="single" w:color="1F3864" w:sz="18"/>
-        </w:pBdr>
-        <w:shd w:fill="F2F4F8" w:val="clear"/>
-        <w:spacing w:after="60" w:before="0" w:line="264"/>
-        <w:ind w:left="280" w:right="120"/>
-      </w:pPr>
-      <w:r>
-        <w:t xml:space="preserve">I started with our Middle East office, working on our exclusive accounts, where I brokered some of the region's biggest partnerships.</w:t>
+        <w:t xml:space="preserve">"I sit in the global sales team at SPORTFIVE, and I look after brand partnerships for our Formula 1 business.</w:t>
+      </w:r>
+    </w:p>
+    <w:p>
+      <w:pPr>
+        <w:pBdr>
+          <w:left w:val="single" w:color="1F3864" w:sz="18"/>
+        </w:pBdr>
+        <w:shd w:fill="F2F4F8" w:val="clear"/>
+        <w:spacing w:after="60" w:before="0" w:line="264"/>
+        <w:ind w:left="280" w:right="120"/>
+      </w:pPr>
+      <w:r>
+        <w:t xml:space="preserve">I spent most of my career in the Middle East. There I was tasked with driving partnerships for the accounts we worked with exclusively, mainly in football and gaming, and we closed some notable strategic partnerships in those years.</w:t>
       </w:r>
     </w:p>
     <w:p>
@@ -880,7 +880,7 @@
         <w:ind w:left="280" w:right="120"/>
       </w:pPr>
       <w:r>
-        <w:t xml:space="preserve">Then I had the opportunity to join one of SPORTFIVE's priority projects, our Formula 1 division. I work closely with Bjorn, and with George here on the call. Our job is simple: deliver partnerships that make sense for both the brand and the rights holder. That is what I do today."</w:t>
+        <w:t xml:space="preserve">Then Formula 1 became a priority project for us, a global vertical of the business. My role in it is simple: drive strategic partnerships that work for both the brand and the rights holder. I do that together with Bjorn, and with George, who is here on the call."</w:t>
       </w:r>
     </w:p>
     <w:p>
@@ -1078,20 +1078,33 @@
         <w:ind w:left="280" w:right="120"/>
       </w:pPr>
       <w:r>
-        <w:t xml:space="preserve">"One thing worth sharing before my questions. When teams assess a new partner, they look across different metrics: budget, brand, audience fit. And one question they always ask: can this partner also support us operationally? A partner whose product does real work for the team is worth more than a logo alone.</w:t>
-      </w:r>
-    </w:p>
-    <w:p>
-      <w:pPr>
-        <w:pBdr>
-          <w:left w:val="single" w:color="1F3864" w:sz="18"/>
-        </w:pBdr>
-        <w:shd w:fill="F2F4F8" w:val="clear"/>
-        <w:spacing w:after="60" w:before="0" w:line="264"/>
-        <w:ind w:left="280" w:right="120"/>
-      </w:pPr>
-      <w:r>
-        <w:t xml:space="preserve">That is why Community jumped out at me. F1 teams have some of the biggest fanbases in sport, but they rent them from social platforms. They do not own a direct line. You built the direct line. Drivers are the new celebrities, and the celebrity texting playbook you invented maps onto them almost perfectly.</w:t>
+        <w:t xml:space="preserve">"One thing before my questions: why this conversation, and why now.</w:t>
+      </w:r>
+    </w:p>
+    <w:p>
+      <w:pPr>
+        <w:pBdr>
+          <w:left w:val="single" w:color="1F3864" w:sz="18"/>
+        </w:pBdr>
+        <w:shd w:fill="F2F4F8" w:val="clear"/>
+        <w:spacing w:after="60" w:before="0" w:line="264"/>
+        <w:ind w:left="280" w:right="120"/>
+      </w:pPr>
+      <w:r>
+        <w:t xml:space="preserve">I did my homework on Community. You built something nobody else had: famous people texting directly with their fans, one to one, at scale. Today brands run on it too, and your AI carries the volume. It is a rare product: personal, owned, and measurable.</w:t>
+      </w:r>
+    </w:p>
+    <w:p>
+      <w:pPr>
+        <w:pBdr>
+          <w:left w:val="single" w:color="1F3864" w:sz="18"/>
+        </w:pBdr>
+        <w:shd w:fill="F2F4F8" w:val="clear"/>
+        <w:spacing w:after="60" w:before="0" w:line="264"/>
+        <w:ind w:left="280" w:right="120"/>
+      </w:pPr>
+      <w:r>
+        <w:t xml:space="preserve">And the timing is why I picked up the phone. The sport's own fan survey says teams and drivers are the new front doors, and fans want to get closer to the people, not the corporation. At the same time, F1 is booming in your home market: three US races, two American teams, Apple broadcasting. So a conversation with Community felt timely.</w:t>
       </w:r>
     </w:p>
     <w:p>
@@ -1104,7 +1117,7 @@
         <w:ind w:left="280" w:right="120"/>
       </w:pPr>
       <w:r>
-        <w:t xml:space="preserve">So potentially worth exploring: a team texting its fans directly, drivers going direct after a race, hospitality run over messaging. Early thoughts. The brief will tell us more."</w:t>
+        <w:t xml:space="preserve">One more thing. When teams assess a new partner, one question they always ask: can this partner also support us operationally? Here the fit is obvious. Teams have huge fanbases, but they rent them from social platforms. They do not own a direct line. You built the direct line. So potentially worth exploring: a team texting its fans directly, drivers going direct after a race, hospitality run over messaging. Early thoughts. The brief will tell us more."</w:t>
       </w:r>
     </w:p>
     <w:p>
@@ -2156,6 +2169,19 @@
     </w:p>
     <w:p>
       <w:pPr>
+        <w:pStyle w:val="ListParagraph"/>
+        <w:numPr>
+          <w:ilvl w:val="0"/>
+          <w:numId w:val="2"/>
+        </w:numPr>
+        <w:spacing w:after="60"/>
+      </w:pPr>
+      <w:r>
+        <w:t xml:space="preserve">Q12. Fan data and consent: who owns what</w:t>
+      </w:r>
+    </w:p>
+    <w:p>
+      <w:pPr>
         <w:pStyle w:val="Heading2"/>
         <w:spacing w:after="120" w:before="280"/>
       </w:pPr>
@@ -2975,6 +3001,67 @@
       </w:pPr>
       <w:r>
         <w:t xml:space="preserve">Mapping messaging and fan engagement across all eleven teams is part of the grid analysis we do after this call. When we come back with recommendations, you will see precisely who is in, who is not, and where the open positions are."</w:t>
+      </w:r>
+    </w:p>
+    <w:p>
+      <w:pPr>
+        <w:pStyle w:val="Heading2"/>
+        <w:spacing w:after="120" w:before="280"/>
+      </w:pPr>
+      <w:r>
+        <w:t xml:space="preserve">Q12. "Fan data and consent: who owns what?</w:t>
+      </w:r>
+    </w:p>
+    <w:p>
+      <w:pPr>
+        <w:pBdr>
+          <w:left w:val="single" w:color="1F3864" w:sz="18"/>
+        </w:pBdr>
+        <w:shd w:fill="F2F4F8" w:val="clear"/>
+        <w:spacing w:after="60" w:before="80" w:line="264"/>
+        <w:ind w:left="280" w:right="120"/>
+      </w:pPr>
+      <w:r>
+        <w:t xml:space="preserve">"The most important question in this category, and the answer must be clean.</w:t>
+      </w:r>
+    </w:p>
+    <w:p>
+      <w:pPr>
+        <w:pBdr>
+          <w:left w:val="single" w:color="1F3864" w:sz="18"/>
+        </w:pBdr>
+        <w:shd w:fill="F2F4F8" w:val="clear"/>
+        <w:spacing w:after="60" w:before="0" w:line="264"/>
+        <w:ind w:left="280" w:right="120"/>
+      </w:pPr>
+      <w:r>
+        <w:t xml:space="preserve">Everything runs on opt-in. Fans choose to join, they can leave any time, and the rules of each market apply. That discipline is your home ground; it is what your platform was built for.</w:t>
+      </w:r>
+    </w:p>
+    <w:p>
+      <w:pPr>
+        <w:pBdr>
+          <w:left w:val="single" w:color="1F3864" w:sz="18"/>
+        </w:pBdr>
+        <w:shd w:fill="F2F4F8" w:val="clear"/>
+        <w:spacing w:after="60" w:before="0" w:line="264"/>
+        <w:ind w:left="280" w:right="120"/>
+      </w:pPr>
+      <w:r>
+        <w:t xml:space="preserve">Ownership is defined in the contract. Usually the team owns its fan relationships, and the partner powers them. What data you can see, use and learn from is negotiated line by line, and we make sure those rights are clear before anyone signs.</w:t>
+      </w:r>
+    </w:p>
+    <w:p>
+      <w:pPr>
+        <w:pBdr>
+          <w:left w:val="single" w:color="1F3864" w:sz="18"/>
+        </w:pBdr>
+        <w:shd w:fill="F2F4F8" w:val="clear"/>
+        <w:spacing w:after="160" w:before="0" w:line="264"/>
+        <w:ind w:left="280" w:right="120"/>
+      </w:pPr>
+      <w:r>
+        <w:t xml:space="preserve">And for the team, this question is the whole point. Today their audience lives on social platforms they do not control. With you, they finally own a direct channel, safely and with consent. The data question is not a risk for you. It is your proof that you take this seriously."</w:t>
       </w:r>
     </w:p>
     <w:p>

</xml_diff>

<commit_message>
Sync heading wording and Italy note across formats
Part 2 beat renamed to why-brand-and-why-now in all three new scripts,
and the Moncler usage note now says the listeners are from Italy.

Co-Authored-By: Claude Fable 5 <noreply@anthropic.com>
Claude-Session: https://claude.ai/code/session_011Vvxd2V3zerAfjn84yXuuv
</commit_message>
<xml_diff>
--- a/call-scripts/Community-F1-Discovery-Call-Script.docx
+++ b/call-scripts/Community-F1-Discovery-Call-Script.docx
@@ -1050,7 +1050,7 @@
         <w:spacing w:after="100" w:before="240"/>
       </w:pPr>
       <w:r>
-        <w:t xml:space="preserve">Why Community caught my attention</w:t>
+        <w:t xml:space="preserve">Why Community, and why now</w:t>
       </w:r>
     </w:p>
     <w:p>
@@ -1065,7 +1065,7 @@
           <w:sz w:val="20"/>
           <w:szCs w:val="20"/>
         </w:rPr>
-        <w:t xml:space="preserve">[Say this early. It plants the integration idea you will ask about in Part 3.]</w:t>
+        <w:t xml:space="preserve">[Say this early. Show the homework, then the timing, then the operational fit.]</w:t>
       </w:r>
     </w:p>
     <w:p>

</xml_diff>

<commit_message>
Sync ongoing-discussion framing through the Community navigator and close
Call-type line, navigator goal, flow row, must-land messages, Part 2
timing, the close, and the after-call checklist now all carry the
ongoing premier-team discussion thread, matching the delivered formats.

Co-Authored-By: Claude Fable 5 <noreply@anthropic.com>
Claude-Session: https://claude.ai/code/session_011Vvxd2V3zerAfjn84yXuuv
</commit_message>
<xml_diff>
--- a/call-scripts/Community-F1-Discovery-Call-Script.docx
+++ b/call-scripts/Community-F1-Discovery-Call-Script.docx
@@ -63,7 +63,7 @@
         <w:t xml:space="preserve">Call type:</w:t>
       </w:r>
       <w:r>
-        <w:t xml:space="preserve"> First call / discovery. Goal: introduce yourself and SPORTFIVE, understand Community's objectives, fill out the brief, show where conversational messaging fits F1, agree next steps.</w:t>
+        <w:t xml:space="preserve"> First call / discovery. Goal: introduce yourself and SPORTFIVE, understand Community's objectives and their ongoing team discussion, fill out the brief, show where conversational messaging fits F1, agree next steps.</w:t>
       </w:r>
     </w:p>
     <w:p>
@@ -108,7 +108,7 @@
         <w:t xml:space="preserve">The goal of this call:</w:t>
       </w:r>
       <w:r>
-        <w:t xml:space="preserve"> understand Community, fill out the brief, and agree the next step: grid mapping, then recommendations. They should leave feeling this costs them nothing, and that F1 is where their product story writes itself.</w:t>
+        <w:t xml:space="preserve"> understand Community, learn where their existing team conversation stands, fill out the brief, and agree the next step: grid mapping, then recommendations. They should leave feeling this costs them nothing, and that we make their hand stronger, not weaker.</w:t>
       </w:r>
     </w:p>
     <w:p>
@@ -201,7 +201,7 @@
           <w:b/>
           <w:bCs/>
         </w:rPr>
-        <w:t xml:space="preserve">Discovery: fill the brief (objectives, audience, markets, budget).</w:t>
+        <w:t xml:space="preserve">Discovery: fill the brief (the ongoing discussion, objectives, audience, budget).</w:t>
       </w:r>
       <w:r>
         <w:t xml:space="preserve"> 15 min</w:t>
@@ -343,33 +343,33 @@
           <w:b/>
           <w:bCs/>
         </w:rPr>
+        <w:t xml:space="preserve">We strengthen the hand you already have.</w:t>
+      </w:r>
+      <w:r>
+        <w:t xml:space="preserve"> A team conversation is running; we bring the market picture, the benchmark, and the negotiation, on your side.</w:t>
+      </w:r>
+    </w:p>
+    <w:p>
+      <w:pPr>
+        <w:pStyle w:val="ListParagraph"/>
+        <w:numPr>
+          <w:ilvl w:val="0"/>
+          <w:numId w:val="2"/>
+        </w:numPr>
+        <w:spacing w:after="60"/>
+      </w:pPr>
+      <w:r>
+        <w:t xml:space="preserve"/>
+      </w:r>
+      <w:r>
+        <w:rPr>
+          <w:b/>
+          <w:bCs/>
+        </w:rPr>
         <w:t xml:space="preserve">Drivers are the new celebrities, and fans want to go direct.</w:t>
       </w:r>
       <w:r>
         <w:t xml:space="preserve"> Community built the direct channel; F1 has 827 million fans who crave exactly that.</w:t>
-      </w:r>
-    </w:p>
-    <w:p>
-      <w:pPr>
-        <w:pStyle w:val="ListParagraph"/>
-        <w:numPr>
-          <w:ilvl w:val="0"/>
-          <w:numId w:val="2"/>
-        </w:numPr>
-        <w:spacing w:after="60"/>
-      </w:pPr>
-      <w:r>
-        <w:t xml:space="preserve"/>
-      </w:r>
-      <w:r>
-        <w:rPr>
-          <w:b/>
-          <w:bCs/>
-        </w:rPr>
-        <w:t xml:space="preserve">Two customers in one buy.</w:t>
-      </w:r>
-      <w:r>
-        <w:t xml:space="preserve"> A team as your live showcase, and a paddock of 350 consumer brands who all need customer engagement.</w:t>
       </w:r>
     </w:p>
     <w:p>
@@ -1038,7 +1038,7 @@
         <w:spacing w:after="160" w:before="360"/>
       </w:pPr>
       <w:r>
-        <w:t xml:space="preserve">Part 2: Frame the call (2 minutes)</w:t>
+        <w:t xml:space="preserve">Part 2: Frame the call (3 minutes)</w:t>
       </w:r>
     </w:p>
     <w:p>
@@ -3278,7 +3278,7 @@
         <w:ind w:left="280" w:right="120"/>
       </w:pPr>
       <w:r>
-        <w:t xml:space="preserve">We take everything from today and build the brief. Then my team maps the full grid against it: which teams fit Community, what is available, at what level, and where you get the most value. We come back with a short list and clear recommendations. Give us [two to three weeks].</w:t>
+        <w:t xml:space="preserve">We take everything from today and build the brief. Then my team maps the full grid against it: which teams fit Community, what is available, at what level, and where you get the most value. If you share where your current conversation stands, we include that context, so you see it next to the rest of the market. We come back with a short list and clear recommendations. Give us [two to three weeks].</w:t>
       </w:r>
     </w:p>
     <w:p>
@@ -3367,7 +3367,7 @@
         <w:spacing w:after="60"/>
       </w:pPr>
       <w:r>
-        <w:t xml:space="preserve">Write up the brief the same day: objectives, audience, markets, integration appetite, budget signals, timeline, decision makers, hospitality needs.</w:t>
+        <w:t xml:space="preserve">Write up the brief the same day: the ongoing discussion (team, stage, sentiment), objectives, audience, markets, integration appetite, budget signals, timeline, decision makers, hospitality needs.</w:t>
       </w:r>
     </w:p>
     <w:p>
@@ -3406,7 +3406,7 @@
         <w:spacing w:after="60"/>
       </w:pPr>
       <w:r>
-        <w:t xml:space="preserve">Log Community in the pipeline register, note the capacity read, and check for category collisions before anything goes out.</w:t>
+        <w:t xml:space="preserve">Log Community in the pipeline register, note the capacity read and the ongoing team discussion, and check for category collisions before anything goes out.</w:t>
       </w:r>
     </w:p>
     <w:sectPr>

</xml_diff>

<commit_message>
Rewrite the Community why-now beat in plain direct language
The homework-and-timing passage now runs as short concrete sentences:
what Community does, what F1 teams lack, the fit, the timing, and one
simple idea, dropping the abstract framing.

Co-Authored-By: Claude Fable 5 <noreply@anthropic.com>
Claude-Session: https://claude.ai/code/session_011Vvxd2V3zerAfjn84yXuuv
</commit_message>
<xml_diff>
--- a/call-scripts/Community-F1-Discovery-Call-Script.docx
+++ b/call-scripts/Community-F1-Discovery-Call-Script.docx
@@ -1114,33 +1114,59 @@
         <w:ind w:left="280" w:right="120"/>
       </w:pPr>
       <w:r>
-        <w:t xml:space="preserve">"One thing before my questions: why this conversation, and why now.</w:t>
-      </w:r>
-    </w:p>
-    <w:p>
-      <w:pPr>
-        <w:pBdr>
-          <w:left w:val="single" w:color="1F3864" w:sz="18"/>
-        </w:pBdr>
-        <w:shd w:fill="F2F4F8" w:val="clear"/>
-        <w:spacing w:after="60" w:before="0" w:line="264"/>
-        <w:ind w:left="280" w:right="120"/>
-      </w:pPr>
-      <w:r>
-        <w:t xml:space="preserve">I did my homework on Community. You built something nobody else had: famous people texting directly with their fans, one to one, at scale. Today brands run on it too, and your AI carries the volume. It is a rare product: personal, owned, and measurable.</w:t>
-      </w:r>
-    </w:p>
-    <w:p>
-      <w:pPr>
-        <w:pBdr>
-          <w:left w:val="single" w:color="1F3864" w:sz="18"/>
-        </w:pBdr>
-        <w:shd w:fill="F2F4F8" w:val="clear"/>
-        <w:spacing w:after="60" w:before="0" w:line="264"/>
-        <w:ind w:left="280" w:right="120"/>
-      </w:pPr>
-      <w:r>
-        <w:t xml:space="preserve">And the timing is why I picked up the phone. The sport's own fan survey says teams and drivers are the new front doors, and fans want to get closer to the people, not the corporation. At the same time, F1 is booming in your home market: three US races, two American teams, Apple broadcasting. So a conversation with Community felt timely.</w:t>
+        <w:t xml:space="preserve">"Before my questions, let me tell you why I wanted this call.</w:t>
+      </w:r>
+    </w:p>
+    <w:p>
+      <w:pPr>
+        <w:pBdr>
+          <w:left w:val="single" w:color="1F3864" w:sz="18"/>
+        </w:pBdr>
+        <w:shd w:fill="F2F4F8" w:val="clear"/>
+        <w:spacing w:after="60" w:before="0" w:line="264"/>
+        <w:ind w:left="280" w:right="120"/>
+      </w:pPr>
+      <w:r>
+        <w:t xml:space="preserve">I looked at what Community does. Simple version: you let famous people and brands text with their fans, one to one, at huge scale. Nobody else does this the way you do.</w:t>
+      </w:r>
+    </w:p>
+    <w:p>
+      <w:pPr>
+        <w:pBdr>
+          <w:left w:val="single" w:color="1F3864" w:sz="18"/>
+        </w:pBdr>
+        <w:shd w:fill="F2F4F8" w:val="clear"/>
+        <w:spacing w:after="60" w:before="0" w:line="264"/>
+        <w:ind w:left="280" w:right="120"/>
+      </w:pPr>
+      <w:r>
+        <w:t xml:space="preserve">Now look at Formula 1. The sport has 827 million fans. The fans love the drivers and want to hear from them directly. But today, a team can only reach its fans through Instagram, TikTok and YouTube. Those platforms sit in the middle. The teams have no direct line to their own fans.</w:t>
+      </w:r>
+    </w:p>
+    <w:p>
+      <w:pPr>
+        <w:pBdr>
+          <w:left w:val="single" w:color="1F3864" w:sz="18"/>
+        </w:pBdr>
+        <w:shd w:fill="F2F4F8" w:val="clear"/>
+        <w:spacing w:after="60" w:before="0" w:line="264"/>
+        <w:ind w:left="280" w:right="120"/>
+      </w:pPr>
+      <w:r>
+        <w:t xml:space="preserve">You built exactly that: the direct line. That is the fit.</w:t>
+      </w:r>
+    </w:p>
+    <w:p>
+      <w:pPr>
+        <w:pBdr>
+          <w:left w:val="single" w:color="1F3864" w:sz="18"/>
+        </w:pBdr>
+        <w:shd w:fill="F2F4F8" w:val="clear"/>
+        <w:spacing w:after="60" w:before="0" w:line="264"/>
+        <w:ind w:left="280" w:right="120"/>
+      </w:pPr>
+      <w:r>
+        <w:t xml:space="preserve">And the timing is good. F1 is growing fastest in America, your home market. Three US races, two American teams, and Apple now shows the races.</w:t>
       </w:r>
     </w:p>
     <w:p>
@@ -1153,7 +1179,7 @@
         <w:ind w:left="280" w:right="120"/>
       </w:pPr>
       <w:r>
-        <w:t xml:space="preserve">One more thing. When teams assess a new partner, one question they always ask: can this partner also support us operationally? Here the fit is obvious. Teams have huge fanbases, but they rent them from social platforms. They do not own a direct line. You built the direct line. So potentially worth exploring: a team texting its fans directly, drivers going direct after a race, hospitality run over messaging. Early thoughts. The brief will tell us more."</w:t>
+        <w:t xml:space="preserve">So here is my simple idea: an F1 team, or a driver, texting with millions of fans through Community. That is what I want to explore with you. That is why I called."</w:t>
       </w:r>
     </w:p>
     <w:p>

</xml_diff>